<commit_message>
Title-case the descriptive skills on both résumés
Keyboard & Screen-Reader-Aware Design, AI-Assisted Analysis & Prototyping,
MCP Integrations, and (master only) AI-Assisted Prototyping, to match the
rest of the skills list.

Co-Authored-By: Claude Opus 5.5 <noreply@anthropic.com>
Claude-Session: https://claude.ai/code/session_013tTYg5CnfyPjY41cDotbqv
</commit_message>
<xml_diff>
--- a/assets/resume.docx
+++ b/assets/resume.docx
@@ -888,7 +888,7 @@
           <w:szCs w:val="22"/>
           <w:rtl w:val="0"/>
         </w:rPr>
-        <w:t xml:space="preserve">HTML, CSS, JavaScript, React Native, AI-assisted prototyping (Claude Code)</w:t>
+        <w:t xml:space="preserve">HTML, CSS, JavaScript, React Native, AI-Assisted Prototyping (Claude Code)</w:t>
       </w:r>
     </w:p>
     <w:p>
@@ -918,7 +918,7 @@
           <w:szCs w:val="22"/>
           <w:rtl w:val="0"/>
         </w:rPr>
-        <w:t xml:space="preserve">WCAG 2.1 AA, CPACC (in progress), keyboard &amp; screen-reader-aware design</w:t>
+        <w:t xml:space="preserve">WCAG 2.1 AA, CPACC (in progress), Keyboard &amp; Screen-Reader-Aware Design</w:t>
       </w:r>
     </w:p>
     <w:p>

</xml_diff>